<commit_message>
templates: Business Case review outcomes + intranet links
Engagement Context, Sensitivity analysis and Supporting Research removed;
sections renumbered; gap table drops a column and a row; Assumptions gains a
Source column and loses 'Used as-is?'.

Each section with relevant source material carries links to the intranet pages
holding it, in a distinct violet marked 'delete this note before you submit'.

The Feedback Record template is retired — feedback is captured in the Business
Case itself — so the file is deleted and the Templates page no longer lists it.

Co-Authored-By: Claude Opus 5 (1M context) <noreply@anthropic.com>
</commit_message>
<xml_diff>
--- a/public/templates/YAT-Business-Case-Template.docx
+++ b/public/templates/YAT-Business-Case-Template.docx
@@ -506,8 +506,98 @@
         <w:pStyle w:val="Heading1"/>
       </w:pPr>
       <w:r>
-        <w:t>2. Engagement Context</w:t>
+        <w:t>2. Strategic Alignment Analysis</w:t>
       </w:r>
+    </w:p>
+    <w:p>
+      <w:pPr>
+        <w:spacing w:before="80" w:after="40"/>
+      </w:pPr>
+      <w:r>
+        <w:rPr>
+          <w:b/>
+          <w:color w:val="6A3EA1"/>
+          <w:sz w:val="18"/>
+        </w:rPr>
+        <w:t>Related resources</w:t>
+      </w:r>
+      <w:r>
+        <w:rPr>
+          <w:i/>
+          <w:color w:val="6A3EA1"/>
+          <w:sz w:val="18"/>
+        </w:rPr>
+        <w:t xml:space="preserve">  (delete this note from the document before you submit your report)</w:t>
+      </w:r>
+    </w:p>
+    <w:p>
+      <w:pPr>
+        <w:spacing w:after="40"/>
+        <w:ind w:left="283"/>
+      </w:pPr>
+      <w:r>
+        <w:rPr>
+          <w:color w:val="6A3EA1"/>
+          <w:sz w:val="18"/>
+        </w:rPr>
+        <w:t xml:space="preserve">• </w:t>
+      </w:r>
+      <w:hyperlink r:id="rId15">
+        <w:r>
+          <w:rPr>
+            <w:sz w:val="18"/>
+            <w:color w:val="6A3EA1"/>
+            <w:u w:val="single"/>
+          </w:rPr>
+          <w:t>ICT Strategic Plan — the objectives you analyse against</w:t>
+        </w:r>
+      </w:hyperlink>
+    </w:p>
+    <w:p>
+      <w:pPr>
+        <w:spacing w:after="40"/>
+        <w:ind w:left="283"/>
+      </w:pPr>
+      <w:r>
+        <w:rPr>
+          <w:color w:val="6A3EA1"/>
+          <w:sz w:val="18"/>
+        </w:rPr>
+        <w:t xml:space="preserve">• </w:t>
+      </w:r>
+      <w:hyperlink r:id="rId16">
+        <w:r>
+          <w:rPr>
+            <w:sz w:val="18"/>
+            <w:color w:val="6A3EA1"/>
+            <w:u w:val="single"/>
+          </w:rPr>
+          <w:t>Industry standards and sector context</w:t>
+        </w:r>
+      </w:hyperlink>
+    </w:p>
+    <w:p>
+      <w:pPr>
+        <w:spacing w:after="160"/>
+        <w:ind w:left="283"/>
+      </w:pPr>
+      <w:r>
+        <w:rPr>
+          <w:color w:val="6A3EA1"/>
+          <w:sz w:val="18"/>
+        </w:rPr>
+        <w:t xml:space="preserve">• </w:t>
+      </w:r>
+      <w:hyperlink r:id="rId17">
+        <w:r>
+          <w:rPr>
+            <w:sz w:val="18"/>
+            <w:color w:val="6A3EA1"/>
+            <w:u w:val="single"/>
+          </w:rPr>
+          <w:t>YAT's public strategic direction</w:t>
+        </w:r>
+      </w:hyperlink>
     </w:p>
     <w:p>
       <w:pPr>
@@ -519,7 +609,7 @@
           <w:color w:val="6B6660"/>
           <w:sz w:val="19"/>
         </w:rPr>
-        <w:t>Establish who you are, the engagement, who you report to, and what this Business Case asks the board to decide. Approx. one short paragraph.</w:t>
+        <w:t>Analyse the organisation's ICT Strategic Plan against the broader industry environment and the organisation's objectives. Identify the objectives material to this initiative (cite them); characterise the relevant industry direction; state where the plan aligns with industry and where it diverges. Approx. 250–400 words.</w:t>
       </w:r>
     </w:p>
     <w:p>
@@ -536,38 +626,98 @@
         <w:pStyle w:val="Heading1"/>
       </w:pPr>
       <w:r>
-        <w:t>3. Strategic Alignment Analysis</w:t>
+        <w:t>3. Current State</w:t>
       </w:r>
     </w:p>
     <w:p>
       <w:pPr>
-        <w:spacing w:after="120"/>
+        <w:spacing w:before="80" w:after="40"/>
       </w:pPr>
       <w:r>
         <w:rPr>
-          <w:i/>
-          <w:color w:val="6B6660"/>
-          <w:sz w:val="19"/>
+          <w:b/>
+          <w:color w:val="6A3EA1"/>
+          <w:sz w:val="18"/>
         </w:rPr>
-        <w:t>Analyse the organisation's ICT Strategic Plan against the broader industry environment and the organisation's objectives. Identify the objectives material to this initiative (cite them); characterise the relevant industry direction; state where the plan aligns with industry and where it diverges; draw out the implications for this initiative. Approx. 250–400 words.</w:t>
+        <w:t>Related resources</w:t>
       </w:r>
-    </w:p>
-    <w:p>
       <w:r>
         <w:rPr>
           <w:i/>
-          <w:color w:val="6B6660"/>
+          <w:color w:val="6A3EA1"/>
+          <w:sz w:val="18"/>
         </w:rPr>
-        <w:t>[ Write your response here ]</w:t>
+        <w:t xml:space="preserve">  (delete this note from the document before you submit your report)</w:t>
       </w:r>
     </w:p>
     <w:p>
       <w:pPr>
-        <w:pStyle w:val="Heading1"/>
+        <w:spacing w:after="40"/>
+        <w:ind w:left="283"/>
       </w:pPr>
       <w:r>
-        <w:t>4. Current State</w:t>
+        <w:rPr>
+          <w:color w:val="6A3EA1"/>
+          <w:sz w:val="18"/>
+        </w:rPr>
+        <w:t xml:space="preserve">• </w:t>
       </w:r>
+      <w:hyperlink r:id="rId18">
+        <w:r>
+          <w:rPr>
+            <w:sz w:val="18"/>
+            <w:color w:val="6A3EA1"/>
+            <w:u w:val="single"/>
+          </w:rPr>
+          <w:t>Current ICT environment overview</w:t>
+        </w:r>
+      </w:hyperlink>
+    </w:p>
+    <w:p>
+      <w:pPr>
+        <w:spacing w:after="40"/>
+        <w:ind w:left="283"/>
+      </w:pPr>
+      <w:r>
+        <w:rPr>
+          <w:color w:val="6A3EA1"/>
+          <w:sz w:val="18"/>
+        </w:rPr>
+        <w:t xml:space="preserve">• </w:t>
+      </w:r>
+      <w:hyperlink r:id="rId19">
+        <w:r>
+          <w:rPr>
+            <w:sz w:val="18"/>
+            <w:color w:val="6A3EA1"/>
+            <w:u w:val="single"/>
+          </w:rPr>
+          <w:t>Network diagram</w:t>
+        </w:r>
+      </w:hyperlink>
+    </w:p>
+    <w:p>
+      <w:pPr>
+        <w:spacing w:after="160"/>
+        <w:ind w:left="283"/>
+      </w:pPr>
+      <w:r>
+        <w:rPr>
+          <w:color w:val="6A3EA1"/>
+          <w:sz w:val="18"/>
+        </w:rPr>
+        <w:t xml:space="preserve">• </w:t>
+      </w:r>
+      <w:hyperlink r:id="rId20">
+        <w:r>
+          <w:rPr>
+            <w:sz w:val="18"/>
+            <w:color w:val="6A3EA1"/>
+            <w:u w:val="single"/>
+          </w:rPr>
+          <w:t>LMS server status</w:t>
+        </w:r>
+      </w:hyperlink>
     </w:p>
     <w:p>
       <w:pPr>
@@ -596,8 +746,75 @@
         <w:pStyle w:val="Heading1"/>
       </w:pPr>
       <w:r>
-        <w:t>5. Gap Analysis</w:t>
+        <w:t>4. Gap Analysis</w:t>
       </w:r>
+    </w:p>
+    <w:p>
+      <w:pPr>
+        <w:spacing w:before="80" w:after="40"/>
+      </w:pPr>
+      <w:r>
+        <w:rPr>
+          <w:b/>
+          <w:color w:val="6A3EA1"/>
+          <w:sz w:val="18"/>
+        </w:rPr>
+        <w:t>Related resources</w:t>
+      </w:r>
+      <w:r>
+        <w:rPr>
+          <w:i/>
+          <w:color w:val="6A3EA1"/>
+          <w:sz w:val="18"/>
+        </w:rPr>
+        <w:t xml:space="preserve">  (delete this note from the document before you submit your report)</w:t>
+      </w:r>
+    </w:p>
+    <w:p>
+      <w:pPr>
+        <w:spacing w:after="40"/>
+        <w:ind w:left="283"/>
+      </w:pPr>
+      <w:r>
+        <w:rPr>
+          <w:color w:val="6A3EA1"/>
+          <w:sz w:val="18"/>
+        </w:rPr>
+        <w:t xml:space="preserve">• </w:t>
+      </w:r>
+      <w:hyperlink r:id="rId21">
+        <w:r>
+          <w:rPr>
+            <w:sz w:val="18"/>
+            <w:color w:val="6A3EA1"/>
+            <w:u w:val="single"/>
+          </w:rPr>
+          <w:t>LMS Cloud Migration Requirements — what the client needs</w:t>
+        </w:r>
+      </w:hyperlink>
+    </w:p>
+    <w:p>
+      <w:pPr>
+        <w:spacing w:after="160"/>
+        <w:ind w:left="283"/>
+      </w:pPr>
+      <w:r>
+        <w:rPr>
+          <w:color w:val="6A3EA1"/>
+          <w:sz w:val="18"/>
+        </w:rPr>
+        <w:t xml:space="preserve">• </w:t>
+      </w:r>
+      <w:hyperlink r:id="rId22">
+        <w:r>
+          <w:rPr>
+            <w:sz w:val="18"/>
+            <w:color w:val="6A3EA1"/>
+            <w:u w:val="single"/>
+          </w:rPr>
+          <w:t>LMS application specification — what the system needs</w:t>
+        </w:r>
+      </w:hyperlink>
     </w:p>
     <w:p>
       <w:pPr>
@@ -620,17 +837,16 @@
         <w:tblLook w:firstColumn="1" w:firstRow="1" w:lastColumn="0" w:lastRow="0" w:noHBand="0" w:noVBand="1" w:val="04A0"/>
       </w:tblPr>
       <w:tblGrid>
-        <w:gridCol w:w="1569"/>
-        <w:gridCol w:w="1569"/>
-        <w:gridCol w:w="1569"/>
-        <w:gridCol w:w="1569"/>
-        <w:gridCol w:w="1569"/>
-        <w:gridCol w:w="1569"/>
+        <w:gridCol w:w="1882"/>
+        <w:gridCol w:w="1882"/>
+        <w:gridCol w:w="1882"/>
+        <w:gridCol w:w="1882"/>
+        <w:gridCol w:w="1882"/>
       </w:tblGrid>
       <w:tr>
         <w:tc>
           <w:tcPr>
-            <w:tcW w:type="dxa" w:w="1701"/>
+            <w:tcW w:type="dxa" w:w="1928"/>
             <w:shd w:val="clear" w:color="auto" w:fill="1F5A5C"/>
             <w:tcBorders>
               <w:top w:val="single" w:sz="4" w:space="0" w:color="E4DED3"/>
@@ -652,7 +868,7 @@
         </w:tc>
         <w:tc>
           <w:tcPr>
-            <w:tcW w:type="dxa" w:w="1474"/>
+            <w:tcW w:type="dxa" w:w="1701"/>
             <w:shd w:val="clear" w:color="auto" w:fill="1F5A5C"/>
             <w:tcBorders>
               <w:top w:val="single" w:sz="4" w:space="0" w:color="E4DED3"/>
@@ -674,29 +890,7 @@
         </w:tc>
         <w:tc>
           <w:tcPr>
-            <w:tcW w:type="dxa" w:w="1474"/>
-            <w:shd w:val="clear" w:color="auto" w:fill="1F5A5C"/>
-            <w:tcBorders>
-              <w:top w:val="single" w:sz="4" w:space="0" w:color="E4DED3"/>
-              <w:left w:val="single" w:sz="4" w:space="0" w:color="E4DED3"/>
-              <w:bottom w:val="single" w:sz="4" w:space="0" w:color="E4DED3"/>
-              <w:right w:val="single" w:sz="4" w:space="0" w:color="E4DED3"/>
-            </w:tcBorders>
-          </w:tcPr>
-          <w:p>
-            <w:r>
-              <w:rPr>
-                <w:b/>
-                <w:color w:val="FFFFFF"/>
-                <w:sz w:val="19"/>
-              </w:rPr>
-              <w:t>Desired future state</w:t>
-            </w:r>
-          </w:p>
-        </w:tc>
-        <w:tc>
-          <w:tcPr>
-            <w:tcW w:type="dxa" w:w="1474"/>
+            <w:tcW w:type="dxa" w:w="1701"/>
             <w:shd w:val="clear" w:color="auto" w:fill="1F5A5C"/>
             <w:tcBorders>
               <w:top w:val="single" w:sz="4" w:space="0" w:color="E4DED3"/>
@@ -718,7 +912,7 @@
         </w:tc>
         <w:tc>
           <w:tcPr>
-            <w:tcW w:type="dxa" w:w="1474"/>
+            <w:tcW w:type="dxa" w:w="1701"/>
             <w:shd w:val="clear" w:color="auto" w:fill="1F5A5C"/>
             <w:tcBorders>
               <w:top w:val="single" w:sz="4" w:space="0" w:color="E4DED3"/>
@@ -740,7 +934,7 @@
         </w:tc>
         <w:tc>
           <w:tcPr>
-            <w:tcW w:type="dxa" w:w="1474"/>
+            <w:tcW w:type="dxa" w:w="1701"/>
             <w:shd w:val="clear" w:color="auto" w:fill="1F5A5C"/>
             <w:tcBorders>
               <w:top w:val="single" w:sz="4" w:space="0" w:color="E4DED3"/>
@@ -764,7 +958,7 @@
       <w:tr>
         <w:tc>
           <w:tcPr>
-            <w:tcW w:type="dxa" w:w="1701"/>
+            <w:tcW w:type="dxa" w:w="1928"/>
             <w:tcBorders>
               <w:top w:val="single" w:sz="4" w:space="0" w:color="E4DED3"/>
               <w:left w:val="single" w:sz="4" w:space="0" w:color="E4DED3"/>
@@ -785,7 +979,7 @@
         </w:tc>
         <w:tc>
           <w:tcPr>
-            <w:tcW w:type="dxa" w:w="1474"/>
+            <w:tcW w:type="dxa" w:w="1701"/>
             <w:tcBorders>
               <w:top w:val="single" w:sz="4" w:space="0" w:color="E4DED3"/>
               <w:left w:val="single" w:sz="4" w:space="0" w:color="E4DED3"/>
@@ -806,7 +1000,7 @@
         </w:tc>
         <w:tc>
           <w:tcPr>
-            <w:tcW w:type="dxa" w:w="1474"/>
+            <w:tcW w:type="dxa" w:w="1701"/>
             <w:tcBorders>
               <w:top w:val="single" w:sz="4" w:space="0" w:color="E4DED3"/>
               <w:left w:val="single" w:sz="4" w:space="0" w:color="E4DED3"/>
@@ -827,7 +1021,7 @@
         </w:tc>
         <w:tc>
           <w:tcPr>
-            <w:tcW w:type="dxa" w:w="1474"/>
+            <w:tcW w:type="dxa" w:w="1701"/>
             <w:tcBorders>
               <w:top w:val="single" w:sz="4" w:space="0" w:color="E4DED3"/>
               <w:left w:val="single" w:sz="4" w:space="0" w:color="E4DED3"/>
@@ -848,28 +1042,7 @@
         </w:tc>
         <w:tc>
           <w:tcPr>
-            <w:tcW w:type="dxa" w:w="1474"/>
-            <w:tcBorders>
-              <w:top w:val="single" w:sz="4" w:space="0" w:color="E4DED3"/>
-              <w:left w:val="single" w:sz="4" w:space="0" w:color="E4DED3"/>
-              <w:bottom w:val="single" w:sz="4" w:space="0" w:color="E4DED3"/>
-              <w:right w:val="single" w:sz="4" w:space="0" w:color="E4DED3"/>
-            </w:tcBorders>
-          </w:tcPr>
-          <w:p>
-            <w:r>
-              <w:rPr>
-                <w:i/>
-                <w:color w:val="6B6660"/>
-                <w:sz w:val="19"/>
-              </w:rPr>
-              <w:t>[ … ]</w:t>
-            </w:r>
-          </w:p>
-        </w:tc>
-        <w:tc>
-          <w:tcPr>
-            <w:tcW w:type="dxa" w:w="1474"/>
+            <w:tcW w:type="dxa" w:w="1701"/>
             <w:tcBorders>
               <w:top w:val="single" w:sz="4" w:space="0" w:color="E4DED3"/>
               <w:left w:val="single" w:sz="4" w:space="0" w:color="E4DED3"/>
@@ -892,7 +1065,7 @@
       <w:tr>
         <w:tc>
           <w:tcPr>
-            <w:tcW w:type="dxa" w:w="1701"/>
+            <w:tcW w:type="dxa" w:w="1928"/>
             <w:tcBorders>
               <w:top w:val="single" w:sz="4" w:space="0" w:color="E4DED3"/>
               <w:left w:val="single" w:sz="4" w:space="0" w:color="E4DED3"/>
@@ -913,7 +1086,7 @@
         </w:tc>
         <w:tc>
           <w:tcPr>
-            <w:tcW w:type="dxa" w:w="1474"/>
+            <w:tcW w:type="dxa" w:w="1701"/>
             <w:tcBorders>
               <w:top w:val="single" w:sz="4" w:space="0" w:color="E4DED3"/>
               <w:left w:val="single" w:sz="4" w:space="0" w:color="E4DED3"/>
@@ -934,7 +1107,7 @@
         </w:tc>
         <w:tc>
           <w:tcPr>
-            <w:tcW w:type="dxa" w:w="1474"/>
+            <w:tcW w:type="dxa" w:w="1701"/>
             <w:tcBorders>
               <w:top w:val="single" w:sz="4" w:space="0" w:color="E4DED3"/>
               <w:left w:val="single" w:sz="4" w:space="0" w:color="E4DED3"/>
@@ -955,7 +1128,7 @@
         </w:tc>
         <w:tc>
           <w:tcPr>
-            <w:tcW w:type="dxa" w:w="1474"/>
+            <w:tcW w:type="dxa" w:w="1701"/>
             <w:tcBorders>
               <w:top w:val="single" w:sz="4" w:space="0" w:color="E4DED3"/>
               <w:left w:val="single" w:sz="4" w:space="0" w:color="E4DED3"/>
@@ -976,156 +1149,7 @@
         </w:tc>
         <w:tc>
           <w:tcPr>
-            <w:tcW w:type="dxa" w:w="1474"/>
-            <w:tcBorders>
-              <w:top w:val="single" w:sz="4" w:space="0" w:color="E4DED3"/>
-              <w:left w:val="single" w:sz="4" w:space="0" w:color="E4DED3"/>
-              <w:bottom w:val="single" w:sz="4" w:space="0" w:color="E4DED3"/>
-              <w:right w:val="single" w:sz="4" w:space="0" w:color="E4DED3"/>
-            </w:tcBorders>
-          </w:tcPr>
-          <w:p>
-            <w:r>
-              <w:rPr>
-                <w:i/>
-                <w:color w:val="6B6660"/>
-                <w:sz w:val="19"/>
-              </w:rPr>
-              <w:t>[ … ]</w:t>
-            </w:r>
-          </w:p>
-        </w:tc>
-        <w:tc>
-          <w:tcPr>
-            <w:tcW w:type="dxa" w:w="1474"/>
-            <w:tcBorders>
-              <w:top w:val="single" w:sz="4" w:space="0" w:color="E4DED3"/>
-              <w:left w:val="single" w:sz="4" w:space="0" w:color="E4DED3"/>
-              <w:bottom w:val="single" w:sz="4" w:space="0" w:color="E4DED3"/>
-              <w:right w:val="single" w:sz="4" w:space="0" w:color="E4DED3"/>
-            </w:tcBorders>
-          </w:tcPr>
-          <w:p>
-            <w:r>
-              <w:rPr>
-                <w:i/>
-                <w:color w:val="6B6660"/>
-                <w:sz w:val="19"/>
-              </w:rPr>
-              <w:t>[ … ]</w:t>
-            </w:r>
-          </w:p>
-        </w:tc>
-      </w:tr>
-      <w:tr>
-        <w:tc>
-          <w:tcPr>
             <w:tcW w:type="dxa" w:w="1701"/>
-            <w:tcBorders>
-              <w:top w:val="single" w:sz="4" w:space="0" w:color="E4DED3"/>
-              <w:left w:val="single" w:sz="4" w:space="0" w:color="E4DED3"/>
-              <w:bottom w:val="single" w:sz="4" w:space="0" w:color="E4DED3"/>
-              <w:right w:val="single" w:sz="4" w:space="0" w:color="E4DED3"/>
-            </w:tcBorders>
-          </w:tcPr>
-          <w:p>
-            <w:r>
-              <w:rPr>
-                <w:i/>
-                <w:color w:val="6B6660"/>
-                <w:sz w:val="19"/>
-              </w:rPr>
-              <w:t>[ Objective ]</w:t>
-            </w:r>
-          </w:p>
-        </w:tc>
-        <w:tc>
-          <w:tcPr>
-            <w:tcW w:type="dxa" w:w="1474"/>
-            <w:tcBorders>
-              <w:top w:val="single" w:sz="4" w:space="0" w:color="E4DED3"/>
-              <w:left w:val="single" w:sz="4" w:space="0" w:color="E4DED3"/>
-              <w:bottom w:val="single" w:sz="4" w:space="0" w:color="E4DED3"/>
-              <w:right w:val="single" w:sz="4" w:space="0" w:color="E4DED3"/>
-            </w:tcBorders>
-          </w:tcPr>
-          <w:p>
-            <w:r>
-              <w:rPr>
-                <w:i/>
-                <w:color w:val="6B6660"/>
-                <w:sz w:val="19"/>
-              </w:rPr>
-              <w:t>[ … ]</w:t>
-            </w:r>
-          </w:p>
-        </w:tc>
-        <w:tc>
-          <w:tcPr>
-            <w:tcW w:type="dxa" w:w="1474"/>
-            <w:tcBorders>
-              <w:top w:val="single" w:sz="4" w:space="0" w:color="E4DED3"/>
-              <w:left w:val="single" w:sz="4" w:space="0" w:color="E4DED3"/>
-              <w:bottom w:val="single" w:sz="4" w:space="0" w:color="E4DED3"/>
-              <w:right w:val="single" w:sz="4" w:space="0" w:color="E4DED3"/>
-            </w:tcBorders>
-          </w:tcPr>
-          <w:p>
-            <w:r>
-              <w:rPr>
-                <w:i/>
-                <w:color w:val="6B6660"/>
-                <w:sz w:val="19"/>
-              </w:rPr>
-              <w:t>[ … ]</w:t>
-            </w:r>
-          </w:p>
-        </w:tc>
-        <w:tc>
-          <w:tcPr>
-            <w:tcW w:type="dxa" w:w="1474"/>
-            <w:tcBorders>
-              <w:top w:val="single" w:sz="4" w:space="0" w:color="E4DED3"/>
-              <w:left w:val="single" w:sz="4" w:space="0" w:color="E4DED3"/>
-              <w:bottom w:val="single" w:sz="4" w:space="0" w:color="E4DED3"/>
-              <w:right w:val="single" w:sz="4" w:space="0" w:color="E4DED3"/>
-            </w:tcBorders>
-          </w:tcPr>
-          <w:p>
-            <w:r>
-              <w:rPr>
-                <w:i/>
-                <w:color w:val="6B6660"/>
-                <w:sz w:val="19"/>
-              </w:rPr>
-              <w:t>[ … ]</w:t>
-            </w:r>
-          </w:p>
-        </w:tc>
-        <w:tc>
-          <w:tcPr>
-            <w:tcW w:type="dxa" w:w="1474"/>
-            <w:tcBorders>
-              <w:top w:val="single" w:sz="4" w:space="0" w:color="E4DED3"/>
-              <w:left w:val="single" w:sz="4" w:space="0" w:color="E4DED3"/>
-              <w:bottom w:val="single" w:sz="4" w:space="0" w:color="E4DED3"/>
-              <w:right w:val="single" w:sz="4" w:space="0" w:color="E4DED3"/>
-            </w:tcBorders>
-          </w:tcPr>
-          <w:p>
-            <w:r>
-              <w:rPr>
-                <w:i/>
-                <w:color w:val="6B6660"/>
-                <w:sz w:val="19"/>
-              </w:rPr>
-              <w:t>[ … ]</w:t>
-            </w:r>
-          </w:p>
-        </w:tc>
-        <w:tc>
-          <w:tcPr>
-            <w:tcW w:type="dxa" w:w="1474"/>
             <w:tcBorders>
               <w:top w:val="single" w:sz="4" w:space="0" w:color="E4DED3"/>
               <w:left w:val="single" w:sz="4" w:space="0" w:color="E4DED3"/>
@@ -1174,15 +1198,82 @@
         <w:pStyle w:val="Heading1"/>
       </w:pPr>
       <w:r>
-        <w:t>6. Options Considered and Evaluation</w:t>
+        <w:t>5. Options Considered and Evaluation</w:t>
       </w:r>
+    </w:p>
+    <w:p>
+      <w:pPr>
+        <w:spacing w:before="80" w:after="40"/>
+      </w:pPr>
+      <w:r>
+        <w:rPr>
+          <w:b/>
+          <w:color w:val="6A3EA1"/>
+          <w:sz w:val="18"/>
+        </w:rPr>
+        <w:t>Related resources</w:t>
+      </w:r>
+      <w:r>
+        <w:rPr>
+          <w:i/>
+          <w:color w:val="6A3EA1"/>
+          <w:sz w:val="18"/>
+        </w:rPr>
+        <w:t xml:space="preserve">  (delete this note from the document before you submit your report)</w:t>
+      </w:r>
+    </w:p>
+    <w:p>
+      <w:pPr>
+        <w:spacing w:after="40"/>
+        <w:ind w:left="283"/>
+      </w:pPr>
+      <w:r>
+        <w:rPr>
+          <w:color w:val="6A3EA1"/>
+          <w:sz w:val="18"/>
+        </w:rPr>
+        <w:t xml:space="preserve">• </w:t>
+      </w:r>
+      <w:hyperlink r:id="rId22">
+        <w:r>
+          <w:rPr>
+            <w:sz w:val="18"/>
+            <w:color w:val="6A3EA1"/>
+            <w:u w:val="single"/>
+          </w:rPr>
+          <w:t>LMS application specification — the workload</w:t>
+        </w:r>
+      </w:hyperlink>
+    </w:p>
+    <w:p>
+      <w:pPr>
+        <w:spacing w:after="160"/>
+        <w:ind w:left="283"/>
+      </w:pPr>
+      <w:r>
+        <w:rPr>
+          <w:color w:val="6A3EA1"/>
+          <w:sz w:val="18"/>
+        </w:rPr>
+        <w:t xml:space="preserve">• </w:t>
+      </w:r>
+      <w:hyperlink r:id="rId23">
+        <w:r>
+          <w:rPr>
+            <w:sz w:val="18"/>
+            <w:color w:val="6A3EA1"/>
+            <w:u w:val="single"/>
+          </w:rPr>
+          <w:t>Reference architectures</w:t>
+        </w:r>
+      </w:hyperlink>
     </w:p>
     <w:p>
       <w:pPr>
         <w:pStyle w:val="Heading2"/>
       </w:pPr>
       <w:r>
-        <w:t>6.1 Workload definition</w:t>
+        <w:t>5.1 Workload definition</w:t>
       </w:r>
     </w:p>
     <w:p>
@@ -1212,7 +1303,7 @@
         <w:pStyle w:val="Heading2"/>
       </w:pPr>
       <w:r>
-        <w:t>6.2 Options considered</w:t>
+        <w:t>5.2 Options considered</w:t>
       </w:r>
     </w:p>
     <w:p>
@@ -1242,7 +1333,7 @@
         <w:pStyle w:val="Heading2"/>
       </w:pPr>
       <w:r>
-        <w:t>6.3 Evaluation method</w:t>
+        <w:t>5.3 Evaluation method</w:t>
       </w:r>
     </w:p>
     <w:p>
@@ -1272,7 +1363,7 @@
         <w:pStyle w:val="Heading2"/>
       </w:pPr>
       <w:r>
-        <w:t>6.4 Initial impact and difficulty assessment</w:t>
+        <w:t>5.4 Initial impact and difficulty assessment</w:t>
       </w:r>
     </w:p>
     <w:tbl>
@@ -1613,8 +1704,118 @@
         <w:pStyle w:val="Heading1"/>
       </w:pPr>
       <w:r>
-        <w:t>7. Cost-Benefit Analysis</w:t>
+        <w:t>6. Cost-Benefit Analysis</w:t>
       </w:r>
+    </w:p>
+    <w:p>
+      <w:pPr>
+        <w:spacing w:after="40"/>
+      </w:pPr>
+      <w:r>
+        <w:rPr>
+          <w:b/>
+          <w:color w:val="6A3EA1"/>
+          <w:sz w:val="18"/>
+        </w:rPr>
+        <w:t xml:space="preserve">Getting started:  </w:t>
+      </w:r>
+      <w:r>
+        <w:rPr>
+          <w:color w:val="6A3EA1"/>
+          <w:sz w:val="18"/>
+        </w:rPr>
+        <w:t>The current operating costs below are your Option A baseline — project them forward five years. You research the Option B (AWS) figures yourself.</w:t>
+      </w:r>
+    </w:p>
+    <w:p>
+      <w:pPr>
+        <w:spacing w:before="80" w:after="40"/>
+      </w:pPr>
+      <w:r>
+        <w:rPr>
+          <w:b/>
+          <w:color w:val="6A3EA1"/>
+          <w:sz w:val="18"/>
+        </w:rPr>
+        <w:t>Related resources</w:t>
+      </w:r>
+      <w:r>
+        <w:rPr>
+          <w:i/>
+          <w:color w:val="6A3EA1"/>
+          <w:sz w:val="18"/>
+        </w:rPr>
+        <w:t xml:space="preserve">  (delete this note from the document before you submit your report)</w:t>
+      </w:r>
+    </w:p>
+    <w:p>
+      <w:pPr>
+        <w:spacing w:after="40"/>
+        <w:ind w:left="283"/>
+      </w:pPr>
+      <w:r>
+        <w:rPr>
+          <w:color w:val="6A3EA1"/>
+          <w:sz w:val="18"/>
+        </w:rPr>
+        <w:t xml:space="preserve">• </w:t>
+      </w:r>
+      <w:hyperlink r:id="rId24">
+        <w:r>
+          <w:rPr>
+            <w:sz w:val="18"/>
+            <w:color w:val="6A3EA1"/>
+            <w:u w:val="single"/>
+          </w:rPr>
+          <w:t>Current LMS operational costing</w:t>
+        </w:r>
+      </w:hyperlink>
+    </w:p>
+    <w:p>
+      <w:pPr>
+        <w:spacing w:after="40"/>
+        <w:ind w:left="283"/>
+      </w:pPr>
+      <w:r>
+        <w:rPr>
+          <w:color w:val="6A3EA1"/>
+          <w:sz w:val="18"/>
+        </w:rPr>
+        <w:t xml:space="preserve">• </w:t>
+      </w:r>
+      <w:hyperlink r:id="rId25">
+        <w:r>
+          <w:rPr>
+            <w:sz w:val="18"/>
+            <w:color w:val="6A3EA1"/>
+            <w:u w:val="single"/>
+          </w:rPr>
+          <w:t>Prior-year LMS costing — for the trend</w:t>
+        </w:r>
+      </w:hyperlink>
+    </w:p>
+    <w:p>
+      <w:pPr>
+        <w:spacing w:after="160"/>
+        <w:ind w:left="283"/>
+      </w:pPr>
+      <w:r>
+        <w:rPr>
+          <w:color w:val="6A3EA1"/>
+          <w:sz w:val="18"/>
+        </w:rPr>
+        <w:t xml:space="preserve">• </w:t>
+      </w:r>
+      <w:hyperlink r:id="rId26">
+        <w:r>
+          <w:rPr>
+            <w:sz w:val="18"/>
+            <w:color w:val="6A3EA1"/>
+            <w:u w:val="single"/>
+          </w:rPr>
+          <w:t>Hardware and software inventory — what a renewal would replace</w:t>
+        </w:r>
+      </w:hyperlink>
     </w:p>
     <w:p>
       <w:pPr>
@@ -1634,7 +1835,20 @@
         <w:pStyle w:val="Heading2"/>
       </w:pPr>
       <w:r>
-        <w:t>7.1 Assumptions</w:t>
+        <w:t>6.1 Assumptions</w:t>
+      </w:r>
+    </w:p>
+    <w:p>
+      <w:pPr>
+        <w:spacing w:after="120"/>
+      </w:pPr>
+      <w:r>
+        <w:rPr>
+          <w:i/>
+          <w:color w:val="6B6660"/>
+          <w:sz w:val="19"/>
+        </w:rPr>
+        <w:t>State each figure you rely on and where it came from — a YAT record, a vendor pricing tool, or your own calculation.</w:t>
       </w:r>
     </w:p>
     <w:tbl>
@@ -1652,7 +1866,7 @@
       <w:tr>
         <w:tc>
           <w:tcPr>
-            <w:tcW w:type="dxa" w:w="3969"/>
+            <w:tcW w:type="dxa" w:w="3685"/>
             <w:shd w:val="clear" w:color="auto" w:fill="1F5A5C"/>
             <w:tcBorders>
               <w:top w:val="single" w:sz="4" w:space="0" w:color="E4DED3"/>
@@ -1674,7 +1888,7 @@
         </w:tc>
         <w:tc>
           <w:tcPr>
-            <w:tcW w:type="dxa" w:w="2835"/>
+            <w:tcW w:type="dxa" w:w="2268"/>
             <w:shd w:val="clear" w:color="auto" w:fill="1F5A5C"/>
             <w:tcBorders>
               <w:top w:val="single" w:sz="4" w:space="0" w:color="E4DED3"/>
@@ -1696,7 +1910,7 @@
         </w:tc>
         <w:tc>
           <w:tcPr>
-            <w:tcW w:type="dxa" w:w="2551"/>
+            <w:tcW w:type="dxa" w:w="3402"/>
             <w:shd w:val="clear" w:color="auto" w:fill="1F5A5C"/>
             <w:tcBorders>
               <w:top w:val="single" w:sz="4" w:space="0" w:color="E4DED3"/>
@@ -1712,7 +1926,7 @@
                 <w:color w:val="FFFFFF"/>
                 <w:sz w:val="19"/>
               </w:rPr>
-              <w:t>Used as-is?</w:t>
+              <w:t>Source</w:t>
             </w:r>
           </w:p>
         </w:tc>
@@ -1720,7 +1934,7 @@
       <w:tr>
         <w:tc>
           <w:tcPr>
-            <w:tcW w:type="dxa" w:w="3969"/>
+            <w:tcW w:type="dxa" w:w="3685"/>
             <w:tcBorders>
               <w:top w:val="single" w:sz="4" w:space="0" w:color="E4DED3"/>
               <w:left w:val="single" w:sz="4" w:space="0" w:color="E4DED3"/>
@@ -1741,7 +1955,7 @@
         </w:tc>
         <w:tc>
           <w:tcPr>
-            <w:tcW w:type="dxa" w:w="2835"/>
+            <w:tcW w:type="dxa" w:w="2268"/>
             <w:tcBorders>
               <w:top w:val="single" w:sz="4" w:space="0" w:color="E4DED3"/>
               <w:left w:val="single" w:sz="4" w:space="0" w:color="E4DED3"/>
@@ -1762,7 +1976,7 @@
         </w:tc>
         <w:tc>
           <w:tcPr>
-            <w:tcW w:type="dxa" w:w="2551"/>
+            <w:tcW w:type="dxa" w:w="3402"/>
             <w:tcBorders>
               <w:top w:val="single" w:sz="4" w:space="0" w:color="E4DED3"/>
               <w:left w:val="single" w:sz="4" w:space="0" w:color="E4DED3"/>
@@ -1777,7 +1991,7 @@
                 <w:color w:val="6B6660"/>
                 <w:sz w:val="19"/>
               </w:rPr>
-              <w:t>[ ] yes  /  [ ] adjusted — see note</w:t>
+              <w:t>[ Where this figure came from ]</w:t>
             </w:r>
           </w:p>
         </w:tc>
@@ -1785,7 +1999,7 @@
       <w:tr>
         <w:tc>
           <w:tcPr>
-            <w:tcW w:type="dxa" w:w="3969"/>
+            <w:tcW w:type="dxa" w:w="3685"/>
             <w:tcBorders>
               <w:top w:val="single" w:sz="4" w:space="0" w:color="E4DED3"/>
               <w:left w:val="single" w:sz="4" w:space="0" w:color="E4DED3"/>
@@ -1806,7 +2020,7 @@
         </w:tc>
         <w:tc>
           <w:tcPr>
-            <w:tcW w:type="dxa" w:w="2835"/>
+            <w:tcW w:type="dxa" w:w="2268"/>
             <w:tcBorders>
               <w:top w:val="single" w:sz="4" w:space="0" w:color="E4DED3"/>
               <w:left w:val="single" w:sz="4" w:space="0" w:color="E4DED3"/>
@@ -1827,7 +2041,7 @@
         </w:tc>
         <w:tc>
           <w:tcPr>
-            <w:tcW w:type="dxa" w:w="2551"/>
+            <w:tcW w:type="dxa" w:w="3402"/>
             <w:tcBorders>
               <w:top w:val="single" w:sz="4" w:space="0" w:color="E4DED3"/>
               <w:left w:val="single" w:sz="4" w:space="0" w:color="E4DED3"/>
@@ -1842,7 +2056,7 @@
                 <w:color w:val="6B6660"/>
                 <w:sz w:val="19"/>
               </w:rPr>
-              <w:t>[ ] yes  /  [ ] adjusted — see note</w:t>
+              <w:t>[ Where this figure came from ]</w:t>
             </w:r>
           </w:p>
         </w:tc>
@@ -1850,7 +2064,7 @@
       <w:tr>
         <w:tc>
           <w:tcPr>
-            <w:tcW w:type="dxa" w:w="3969"/>
+            <w:tcW w:type="dxa" w:w="3685"/>
             <w:tcBorders>
               <w:top w:val="single" w:sz="4" w:space="0" w:color="E4DED3"/>
               <w:left w:val="single" w:sz="4" w:space="0" w:color="E4DED3"/>
@@ -1871,7 +2085,7 @@
         </w:tc>
         <w:tc>
           <w:tcPr>
-            <w:tcW w:type="dxa" w:w="2835"/>
+            <w:tcW w:type="dxa" w:w="2268"/>
             <w:tcBorders>
               <w:top w:val="single" w:sz="4" w:space="0" w:color="E4DED3"/>
               <w:left w:val="single" w:sz="4" w:space="0" w:color="E4DED3"/>
@@ -1892,7 +2106,7 @@
         </w:tc>
         <w:tc>
           <w:tcPr>
-            <w:tcW w:type="dxa" w:w="2551"/>
+            <w:tcW w:type="dxa" w:w="3402"/>
             <w:tcBorders>
               <w:top w:val="single" w:sz="4" w:space="0" w:color="E4DED3"/>
               <w:left w:val="single" w:sz="4" w:space="0" w:color="E4DED3"/>
@@ -1907,7 +2121,7 @@
                 <w:color w:val="6B6660"/>
                 <w:sz w:val="19"/>
               </w:rPr>
-              <w:t>[ ] yes  /  [ ] adjusted — see note</w:t>
+              <w:t>[ Where this figure came from ]</w:t>
             </w:r>
           </w:p>
         </w:tc>
@@ -1915,7 +2129,7 @@
       <w:tr>
         <w:tc>
           <w:tcPr>
-            <w:tcW w:type="dxa" w:w="3969"/>
+            <w:tcW w:type="dxa" w:w="3685"/>
             <w:tcBorders>
               <w:top w:val="single" w:sz="4" w:space="0" w:color="E4DED3"/>
               <w:left w:val="single" w:sz="4" w:space="0" w:color="E4DED3"/>
@@ -1936,7 +2150,7 @@
         </w:tc>
         <w:tc>
           <w:tcPr>
-            <w:tcW w:type="dxa" w:w="2835"/>
+            <w:tcW w:type="dxa" w:w="2268"/>
             <w:tcBorders>
               <w:top w:val="single" w:sz="4" w:space="0" w:color="E4DED3"/>
               <w:left w:val="single" w:sz="4" w:space="0" w:color="E4DED3"/>
@@ -1957,7 +2171,7 @@
         </w:tc>
         <w:tc>
           <w:tcPr>
-            <w:tcW w:type="dxa" w:w="2551"/>
+            <w:tcW w:type="dxa" w:w="3402"/>
             <w:tcBorders>
               <w:top w:val="single" w:sz="4" w:space="0" w:color="E4DED3"/>
               <w:left w:val="single" w:sz="4" w:space="0" w:color="E4DED3"/>
@@ -1972,7 +2186,7 @@
                 <w:color w:val="6B6660"/>
                 <w:sz w:val="19"/>
               </w:rPr>
-              <w:t>[ ] yes  /  [ ] adjusted — see note</w:t>
+              <w:t>[ Where this figure came from ]</w:t>
             </w:r>
           </w:p>
         </w:tc>
@@ -1984,7 +2198,7 @@
         <w:pStyle w:val="Heading2"/>
       </w:pPr>
       <w:r>
-        <w:t>7.2 Option A — 5-year summary</w:t>
+        <w:t>6.2 Option A — 5-year summary</w:t>
       </w:r>
     </w:p>
     <w:tbl>
@@ -2598,7 +2812,7 @@
         <w:pStyle w:val="Heading2"/>
       </w:pPr>
       <w:r>
-        <w:t>7.3 Option B — 5-year summary</w:t>
+        <w:t>6.3 Option B — 5-year summary</w:t>
       </w:r>
     </w:p>
     <w:tbl>
@@ -3359,7 +3573,7 @@
         <w:pStyle w:val="Heading2"/>
       </w:pPr>
       <w:r>
-        <w:t>7.4 Quantified benefit (e.g. avoided downtime)</w:t>
+        <w:t>6.4 Quantified benefit (e.g. avoided downtime)</w:t>
       </w:r>
     </w:p>
     <w:p>
@@ -3389,7 +3603,7 @@
         <w:pStyle w:val="Heading2"/>
       </w:pPr>
       <w:r>
-        <w:t>7.5 Comparison summary</w:t>
+        <w:t>6.5 Comparison summary</w:t>
       </w:r>
     </w:p>
     <w:tbl>
@@ -3748,48 +3962,85 @@
     <w:p/>
     <w:p>
       <w:pPr>
-        <w:pStyle w:val="Heading2"/>
+        <w:pStyle w:val="Heading1"/>
       </w:pPr>
       <w:r>
-        <w:t>7.6 Sensitivity analysis</w:t>
+        <w:t>7. Risk and Impact Assessment</w:t>
       </w:r>
     </w:p>
     <w:p>
       <w:pPr>
-        <w:spacing w:after="120"/>
+        <w:spacing w:before="80" w:after="40"/>
       </w:pPr>
       <w:r>
         <w:rPr>
-          <w:i/>
-          <w:color w:val="6B6660"/>
-          <w:sz w:val="19"/>
+          <w:b/>
+          <w:color w:val="6A3EA1"/>
+          <w:sz w:val="18"/>
         </w:rPr>
-        <w:t>Pick at least two assumptions where a reasonable change would materially affect the outcome. Show the recalculation and the effect on the recommendation.</w:t>
+        <w:t>Related resources</w:t>
       </w:r>
-    </w:p>
-    <w:p>
       <w:r>
         <w:rPr>
           <w:i/>
-          <w:color w:val="6B6660"/>
+          <w:color w:val="6A3EA1"/>
+          <w:sz w:val="18"/>
         </w:rPr>
-        <w:t>[ Write your response here ]</w:t>
+        <w:t xml:space="preserve">  (delete this note from the document before you submit your report)</w:t>
       </w:r>
     </w:p>
     <w:p>
       <w:pPr>
-        <w:pStyle w:val="Heading1"/>
+        <w:spacing w:after="40"/>
+        <w:ind w:left="283"/>
       </w:pPr>
       <w:r>
-        <w:t>8. Risk and Impact Assessment</w:t>
+        <w:rPr>
+          <w:color w:val="6A3EA1"/>
+          <w:sz w:val="18"/>
+        </w:rPr>
+        <w:t xml:space="preserve">• </w:t>
       </w:r>
+      <w:hyperlink r:id="rId27">
+        <w:r>
+          <w:rPr>
+            <w:sz w:val="18"/>
+            <w:color w:val="6A3EA1"/>
+            <w:u w:val="single"/>
+          </w:rPr>
+          <w:t>Legislative and regulatory obligations</w:t>
+        </w:r>
+      </w:hyperlink>
+    </w:p>
+    <w:p>
+      <w:pPr>
+        <w:spacing w:after="160"/>
+        <w:ind w:left="283"/>
+      </w:pPr>
+      <w:r>
+        <w:rPr>
+          <w:color w:val="6A3EA1"/>
+          <w:sz w:val="18"/>
+        </w:rPr>
+        <w:t xml:space="preserve">• </w:t>
+      </w:r>
+      <w:hyperlink r:id="rId28">
+        <w:r>
+          <w:rPr>
+            <w:sz w:val="18"/>
+            <w:color w:val="6A3EA1"/>
+            <w:u w:val="single"/>
+          </w:rPr>
+          <w:t>Backup and retention policy</w:t>
+        </w:r>
+      </w:hyperlink>
     </w:p>
     <w:p>
       <w:pPr>
         <w:pStyle w:val="Heading2"/>
       </w:pPr>
       <w:r>
-        <w:t>8.1 Intangibles comparison</w:t>
+        <w:t>7.1 Intangibles comparison</w:t>
       </w:r>
     </w:p>
     <w:p>
@@ -4282,7 +4533,7 @@
         <w:pStyle w:val="Heading2"/>
       </w:pPr>
       <w:r>
-        <w:t>8.2 Risk register (recommended option)</w:t>
+        <w:t>7.2 Risk register (recommended option)</w:t>
       </w:r>
     </w:p>
     <w:tbl>
@@ -4653,7 +4904,7 @@
         <w:pStyle w:val="Heading1"/>
       </w:pPr>
       <w:r>
-        <w:t>9. Recommendation</w:t>
+        <w:t>8. Recommendation</w:t>
       </w:r>
     </w:p>
     <w:p>
@@ -4666,7 +4917,7 @@
           <w:color w:val="6B6660"/>
           <w:sz w:val="19"/>
         </w:rPr>
-        <w:t>State the recommended option and the headline rationale (3–5 sentences) — connect it to the CBA findings, the intangibles, and the risk register. This drives the prioritisation and action plan in §10.</w:t>
+        <w:t>State the recommended option and the headline rationale (3–5 sentences) — connect it to the CBA findings, the intangibles, and the risk register. This drives the prioritisation and action plan in §9.</w:t>
       </w:r>
     </w:p>
     <w:p>
@@ -4683,15 +4934,82 @@
         <w:pStyle w:val="Heading1"/>
       </w:pPr>
       <w:r>
-        <w:t>10. Action Plan</w:t>
+        <w:t>9. Action Plan</w:t>
       </w:r>
+    </w:p>
+    <w:p>
+      <w:pPr>
+        <w:spacing w:before="80" w:after="40"/>
+      </w:pPr>
+      <w:r>
+        <w:rPr>
+          <w:b/>
+          <w:color w:val="6A3EA1"/>
+          <w:sz w:val="18"/>
+        </w:rPr>
+        <w:t>Related resources</w:t>
+      </w:r>
+      <w:r>
+        <w:rPr>
+          <w:i/>
+          <w:color w:val="6A3EA1"/>
+          <w:sz w:val="18"/>
+        </w:rPr>
+        <w:t xml:space="preserve">  (delete this note from the document before you submit your report)</w:t>
+      </w:r>
+    </w:p>
+    <w:p>
+      <w:pPr>
+        <w:spacing w:after="40"/>
+        <w:ind w:left="283"/>
+      </w:pPr>
+      <w:r>
+        <w:rPr>
+          <w:color w:val="6A3EA1"/>
+          <w:sz w:val="18"/>
+        </w:rPr>
+        <w:t xml:space="preserve">• </w:t>
+      </w:r>
+      <w:hyperlink r:id="rId29">
+        <w:r>
+          <w:rPr>
+            <w:sz w:val="18"/>
+            <w:color w:val="6A3EA1"/>
+            <w:u w:val="single"/>
+          </w:rPr>
+          <w:t>ICT Change Management Procedure</w:t>
+        </w:r>
+      </w:hyperlink>
+    </w:p>
+    <w:p>
+      <w:pPr>
+        <w:spacing w:after="160"/>
+        <w:ind w:left="283"/>
+      </w:pPr>
+      <w:r>
+        <w:rPr>
+          <w:color w:val="6A3EA1"/>
+          <w:sz w:val="18"/>
+        </w:rPr>
+        <w:t xml:space="preserve">• </w:t>
+      </w:r>
+      <w:hyperlink r:id="rId30">
+        <w:r>
+          <w:rPr>
+            <w:sz w:val="18"/>
+            <w:color w:val="6A3EA1"/>
+            <w:u w:val="single"/>
+          </w:rPr>
+          <w:t>User access policy — who needs access, and when</w:t>
+        </w:r>
+      </w:hyperlink>
     </w:p>
     <w:p>
       <w:pPr>
         <w:pStyle w:val="Heading2"/>
       </w:pPr>
       <w:r>
-        <w:t>10.1 Prioritised changes</w:t>
+        <w:t>9.1 Prioritised changes</w:t>
       </w:r>
     </w:p>
     <w:tbl>
@@ -4970,7 +5288,7 @@
         <w:pStyle w:val="Heading2"/>
       </w:pPr>
       <w:r>
-        <w:t>10.2 Implementation schedule</w:t>
+        <w:t>9.2 Implementation schedule</w:t>
       </w:r>
     </w:p>
     <w:p>
@@ -5518,7 +5836,7 @@
         <w:pStyle w:val="Heading2"/>
       </w:pPr>
       <w:r>
-        <w:t>10.3 Standards, targets, and success metrics</w:t>
+        <w:t>9.3 Standards, targets, and success metrics</w:t>
       </w:r>
     </w:p>
     <w:tbl>
@@ -5868,7 +6186,7 @@
         <w:pStyle w:val="Heading2"/>
       </w:pPr>
       <w:r>
-        <w:t>10.4 Implementation methods</w:t>
+        <w:t>9.4 Implementation methods</w:t>
       </w:r>
     </w:p>
     <w:p>
@@ -5898,7 +6216,7 @@
         <w:pStyle w:val="Heading2"/>
       </w:pPr>
       <w:r>
-        <w:t>10.5 Alignment with change-management procedure</w:t>
+        <w:t>9.5 Alignment with change-management procedure</w:t>
       </w:r>
     </w:p>
     <w:p>
@@ -5928,7 +6246,7 @@
         <w:pStyle w:val="Heading1"/>
       </w:pPr>
       <w:r>
-        <w:t>11. Next Steps and Decision Requested</w:t>
+        <w:t>10. Next Steps and Decision Requested</w:t>
       </w:r>
     </w:p>
     <w:p>
@@ -5958,7 +6276,7 @@
         <w:pStyle w:val="Heading1"/>
       </w:pPr>
       <w:r>
-        <w:t>12. Feedback</w:t>
+        <w:t>11. Feedback</w:t>
       </w:r>
     </w:p>
     <w:p>
@@ -6669,7 +6987,7 @@
           <w:color w:val="6B6660"/>
           <w:sz w:val="19"/>
         </w:rPr>
-        <w:t>The detailed line items underpinning the §7 summary tables — one-off and recurring costs per option, and the year-by-year projection whose totals feed §7. Build out the line-item tables here per option.</w:t>
+        <w:t>The detailed line items underpinning the §6 summary tables — one-off and recurring costs per option, and the year-by-year projection whose totals feed §6. Build out the line-item tables here per option.</w:t>
       </w:r>
     </w:p>
     <w:p>
@@ -6681,39 +6999,9 @@
         <w:t>[ Detailed CBA line-item tables ]</w:t>
       </w:r>
     </w:p>
-    <w:p>
-      <w:pPr>
-        <w:pStyle w:val="Heading1"/>
-      </w:pPr>
-      <w:r>
-        <w:t>Appendix 2 — Supporting Research</w:t>
-      </w:r>
-    </w:p>
-    <w:p>
-      <w:pPr>
-        <w:spacing w:after="120"/>
-      </w:pPr>
-      <w:r>
-        <w:rPr>
-          <w:i/>
-          <w:color w:val="6B6660"/>
-          <w:sz w:val="19"/>
-        </w:rPr>
-        <w:t>Attach or link the supporting research: pricing-calculator exports for the Appendix 1 figures, industry-environment sources cited in §3 (with access dates), and any other supporting material.</w:t>
-      </w:r>
-    </w:p>
-    <w:p>
-      <w:r>
-        <w:rPr>
-          <w:i/>
-          <w:color w:val="6B6660"/>
-        </w:rPr>
-        <w:t>[ Supporting research ]</w:t>
-      </w:r>
-    </w:p>
     <w:sectPr>
-      <w:headerReference w:type="default" r:id="rId15"/>
-      <w:footerReference w:type="default" r:id="rId16"/>
+      <w:headerReference w:type="default" r:id="rId31"/>
+      <w:footerReference w:type="default" r:id="rId32"/>
       <w:pgSz w:w="11906" w:h="16838"/>
       <w:pgMar w:top="1474" w:right="1247" w:bottom="1247" w:left="1247" w:header="567" w:footer="567" w:gutter="0"/>
       <w:cols w:space="720"/>

</xml_diff>